<commit_message>
docs(hslabour): expand client guide with detailed 'how it works' for shop, affiliate, e-book, insights
Co-Authored-By: Claude Opus 4.8 <noreply@anthropic.com>
</commit_message>
<xml_diff>
--- a/hslabour/docs/HS-Labour-Website-Guide.docx
+++ b/hslabour/docs/HS-Labour-Website-Guide.docx
@@ -1747,6 +1747,906 @@
           <w:color w:val="011D58"/>
           <w:sz w:val="34"/>
         </w:rPr>
+        <w:t>How the key features work</w:t>
+      </w:r>
+    </w:p>
+    <w:p>
+      <w:pPr>
+        <w:spacing w:before="40" w:after="200"/>
+        <w:pBdr>
+          <w:bottom w:val="single" w:sz="16" w:space="1" w:color="46D835"/>
+        </w:pBdr>
+      </w:pPr>
+    </w:p>
+    <w:p>
+      <w:pPr>
+        <w:spacing w:after="120"/>
+      </w:pPr>
+      <w:r>
+        <w:rPr>
+          <w:color w:val="1F2937"/>
+          <w:sz w:val="21"/>
+        </w:rPr>
+        <w:t>This section explains, in plain terms, how your money-making and content features actually operate day to day.</w:t>
+      </w:r>
+    </w:p>
+    <w:p>
+      <w:pPr>
+        <w:keepNext/>
+        <w:spacing w:before="200" w:after="60"/>
+      </w:pPr>
+      <w:r>
+        <w:rPr>
+          <w:rFonts w:ascii="Segoe UI Semibold" w:hAnsi="Segoe UI Semibold"/>
+          <w:b/>
+          <w:color w:val="2FA823"/>
+          <w:sz w:val="25"/>
+        </w:rPr>
+        <w:t>4.1  The Shop — digital products &amp; done-for-you services</w:t>
+      </w:r>
+    </w:p>
+    <w:p>
+      <w:pPr>
+        <w:spacing w:after="120"/>
+      </w:pPr>
+      <w:r>
+        <w:rPr>
+          <w:color w:val="1F2937"/>
+          <w:sz w:val="21"/>
+        </w:rPr>
+        <w:t>The shop sells two kinds of products to job seekers:</w:t>
+      </w:r>
+    </w:p>
+    <w:p>
+      <w:pPr>
+        <w:pStyle w:val="ListBullet"/>
+        <w:spacing w:after="60"/>
+        <w:ind w:left="340"/>
+      </w:pPr>
+      <w:r>
+        <w:rPr>
+          <w:b/>
+          <w:color w:val="011D58"/>
+          <w:sz w:val="21"/>
+        </w:rPr>
+        <w:t xml:space="preserve">Instant downloads — </w:t>
+      </w:r>
+      <w:r>
+        <w:rPr>
+          <w:color w:val="1F2937"/>
+          <w:sz w:val="21"/>
+        </w:rPr>
+        <w:t>CV templates (private and government sector) — paid for once and downloaded instantly.</w:t>
+      </w:r>
+    </w:p>
+    <w:p>
+      <w:pPr>
+        <w:pStyle w:val="ListBullet"/>
+        <w:spacing w:after="60"/>
+        <w:ind w:left="340"/>
+      </w:pPr>
+      <w:r>
+        <w:rPr>
+          <w:b/>
+          <w:color w:val="011D58"/>
+          <w:sz w:val="21"/>
+        </w:rPr>
+        <w:t xml:space="preserve">Done-for-you services — </w:t>
+      </w:r>
+      <w:r>
+        <w:rPr>
+          <w:color w:val="1F2937"/>
+          <w:sz w:val="21"/>
+        </w:rPr>
+        <w:t>CV Revamp, Cover Letter writing, Criminal Record Checks, Qualification Verification and Umalusi Matric Certification — where a specialist completes the work for the customer.</w:t>
+      </w:r>
+    </w:p>
+    <w:p>
+      <w:pPr>
+        <w:spacing w:after="40"/>
+      </w:pPr>
+      <w:r>
+        <w:rPr>
+          <w:color w:val="1F2937"/>
+          <w:sz w:val="21"/>
+        </w:rPr>
+        <w:t>How a purchase works:</w:t>
+      </w:r>
+    </w:p>
+    <w:p>
+      <w:pPr>
+        <w:spacing w:after="60"/>
+        <w:ind w:left="170"/>
+      </w:pPr>
+      <w:r>
+        <w:rPr>
+          <w:b/>
+          <w:color w:val="2FA823"/>
+          <w:sz w:val="21"/>
+        </w:rPr>
+        <w:t xml:space="preserve">1.  </w:t>
+      </w:r>
+      <w:r>
+        <w:rPr>
+          <w:color w:val="1F2937"/>
+          <w:sz w:val="21"/>
+        </w:rPr>
+        <w:t>The customer browses the Shop and opens a product page.</w:t>
+      </w:r>
+    </w:p>
+    <w:p>
+      <w:pPr>
+        <w:spacing w:after="60"/>
+        <w:ind w:left="170"/>
+      </w:pPr>
+      <w:r>
+        <w:rPr>
+          <w:b/>
+          <w:color w:val="2FA823"/>
+          <w:sz w:val="21"/>
+        </w:rPr>
+        <w:t xml:space="preserve">2.  </w:t>
+      </w:r>
+      <w:r>
+        <w:rPr>
+          <w:color w:val="1F2937"/>
+          <w:sz w:val="21"/>
+        </w:rPr>
+        <w:t>They check out and pay securely via PayFast (card or instant EFT).</w:t>
+      </w:r>
+    </w:p>
+    <w:p>
+      <w:pPr>
+        <w:spacing w:after="60"/>
+        <w:ind w:left="170"/>
+      </w:pPr>
+      <w:r>
+        <w:rPr>
+          <w:b/>
+          <w:color w:val="2FA823"/>
+          <w:sz w:val="21"/>
+        </w:rPr>
+        <w:t xml:space="preserve">3.  </w:t>
+      </w:r>
+      <w:r>
+        <w:rPr>
+          <w:color w:val="1F2937"/>
+          <w:sz w:val="21"/>
+        </w:rPr>
+        <w:t>Instant products: they immediately receive a secure download link.</w:t>
+      </w:r>
+    </w:p>
+    <w:p>
+      <w:pPr>
+        <w:spacing w:after="60"/>
+        <w:ind w:left="170"/>
+      </w:pPr>
+      <w:r>
+        <w:rPr>
+          <w:b/>
+          <w:color w:val="2FA823"/>
+          <w:sz w:val="21"/>
+        </w:rPr>
+        <w:t xml:space="preserve">4.  </w:t>
+      </w:r>
+      <w:r>
+        <w:rPr>
+          <w:color w:val="1F2937"/>
+          <w:sz w:val="21"/>
+        </w:rPr>
+        <w:t>Services: the order opens in your admin 'Service jobs' pipeline, and the customer gets a private tracking link — no login needed.</w:t>
+      </w:r>
+    </w:p>
+    <w:p>
+      <w:pPr>
+        <w:spacing w:after="60"/>
+        <w:ind w:left="170"/>
+      </w:pPr>
+      <w:r>
+        <w:rPr>
+          <w:b/>
+          <w:color w:val="2FA823"/>
+          <w:sz w:val="21"/>
+        </w:rPr>
+        <w:t xml:space="preserve">5.  </w:t>
+      </w:r>
+      <w:r>
+        <w:rPr>
+          <w:color w:val="1F2937"/>
+          <w:sz w:val="21"/>
+        </w:rPr>
+        <w:t>Depending on the service, the customer uploads documents (e.g. their current CV for a Revamp) or books an in-person fingerprint appointment (Criminal Record Check) — with consent captured where the law requires it.</w:t>
+      </w:r>
+    </w:p>
+    <w:p>
+      <w:pPr>
+        <w:spacing w:after="60"/>
+        <w:ind w:left="170"/>
+      </w:pPr>
+      <w:r>
+        <w:rPr>
+          <w:b/>
+          <w:color w:val="2FA823"/>
+          <w:sz w:val="21"/>
+        </w:rPr>
+        <w:t xml:space="preserve">6.  </w:t>
+      </w:r>
+      <w:r>
+        <w:rPr>
+          <w:color w:val="1F2937"/>
+          <w:sz w:val="21"/>
+        </w:rPr>
+        <w:t>Your team moves the job through Received → In progress → Delivered and uploads the finished file.</w:t>
+      </w:r>
+    </w:p>
+    <w:p>
+      <w:pPr>
+        <w:spacing w:after="60"/>
+        <w:ind w:left="170"/>
+      </w:pPr>
+      <w:r>
+        <w:rPr>
+          <w:b/>
+          <w:color w:val="2FA823"/>
+          <w:sz w:val="21"/>
+        </w:rPr>
+        <w:t xml:space="preserve">7.  </w:t>
+      </w:r>
+      <w:r>
+        <w:rPr>
+          <w:color w:val="1F2937"/>
+          <w:sz w:val="21"/>
+        </w:rPr>
+        <w:t>The customer downloads the deliverable from their tracking link, and can request a revision if the service includes one.</w:t>
+      </w:r>
+    </w:p>
+    <w:p>
+      <w:pPr>
+        <w:spacing w:before="60" w:after="200"/>
+        <w:ind w:left="170"/>
+      </w:pPr>
+      <w:r>
+        <w:rPr>
+          <w:b/>
+          <w:color w:val="2FA823"/>
+          <w:sz w:val="20"/>
+        </w:rPr>
+        <w:t xml:space="preserve">You control:  </w:t>
+      </w:r>
+      <w:r>
+        <w:rPr>
+          <w:color w:val="475569"/>
+          <w:sz w:val="20"/>
+        </w:rPr>
+        <w:t>products, prices, downloadable files, turnaround times and which products are visible — all under Admin → Shop and Admin → Service jobs.</w:t>
+      </w:r>
+    </w:p>
+    <w:p>
+      <w:pPr>
+        <w:keepNext/>
+        <w:spacing w:before="200" w:after="60"/>
+      </w:pPr>
+      <w:r>
+        <w:rPr>
+          <w:rFonts w:ascii="Segoe UI Semibold" w:hAnsi="Segoe UI Semibold"/>
+          <w:b/>
+          <w:color w:val="2FA823"/>
+          <w:sz w:val="25"/>
+        </w:rPr>
+        <w:t>4.2  The Affiliate Program — referral commissions</w:t>
+      </w:r>
+    </w:p>
+    <w:p>
+      <w:pPr>
+        <w:spacing w:after="120"/>
+      </w:pPr>
+      <w:r>
+        <w:rPr>
+          <w:color w:val="1F2937"/>
+          <w:sz w:val="21"/>
+        </w:rPr>
+        <w:t>A free, self-running way for anyone to earn commission by promoting your job-hunting e-book — turning fans and partners into a sales force.</w:t>
+      </w:r>
+    </w:p>
+    <w:p>
+      <w:pPr>
+        <w:spacing w:after="60"/>
+        <w:ind w:left="170"/>
+      </w:pPr>
+      <w:r>
+        <w:rPr>
+          <w:b/>
+          <w:color w:val="2FA823"/>
+          <w:sz w:val="21"/>
+        </w:rPr>
+        <w:t xml:space="preserve">1.  </w:t>
+      </w:r>
+      <w:r>
+        <w:rPr>
+          <w:color w:val="1F2937"/>
+          <w:sz w:val="21"/>
+        </w:rPr>
+        <w:t>Someone signs up to become an affiliate (with email verification and anti-spam protection).</w:t>
+      </w:r>
+    </w:p>
+    <w:p>
+      <w:pPr>
+        <w:spacing w:after="60"/>
+        <w:ind w:left="170"/>
+      </w:pPr>
+      <w:r>
+        <w:rPr>
+          <w:b/>
+          <w:color w:val="2FA823"/>
+          <w:sz w:val="21"/>
+        </w:rPr>
+        <w:t xml:space="preserve">2.  </w:t>
+      </w:r>
+      <w:r>
+        <w:rPr>
+          <w:color w:val="1F2937"/>
+          <w:sz w:val="21"/>
+        </w:rPr>
+        <w:t>You review the application under Admin → Affiliates and approve it; the system issues a unique tracking code.</w:t>
+      </w:r>
+    </w:p>
+    <w:p>
+      <w:pPr>
+        <w:spacing w:after="60"/>
+        <w:ind w:left="170"/>
+      </w:pPr>
+      <w:r>
+        <w:rPr>
+          <w:b/>
+          <w:color w:val="2FA823"/>
+          <w:sz w:val="21"/>
+        </w:rPr>
+        <w:t xml:space="preserve">3.  </w:t>
+      </w:r>
+      <w:r>
+        <w:rPr>
+          <w:color w:val="1F2937"/>
+          <w:sz w:val="21"/>
+        </w:rPr>
+        <w:t>The affiliate logs into their own dashboard and gets a unique referral link.</w:t>
+      </w:r>
+    </w:p>
+    <w:p>
+      <w:pPr>
+        <w:spacing w:after="60"/>
+        <w:ind w:left="170"/>
+      </w:pPr>
+      <w:r>
+        <w:rPr>
+          <w:b/>
+          <w:color w:val="2FA823"/>
+          <w:sz w:val="21"/>
+        </w:rPr>
+        <w:t xml:space="preserve">4.  </w:t>
+      </w:r>
+      <w:r>
+        <w:rPr>
+          <w:color w:val="1F2937"/>
+          <w:sz w:val="21"/>
+        </w:rPr>
+        <w:t>They share that link on social media, a blog, WhatsApp or by word of mouth.</w:t>
+      </w:r>
+    </w:p>
+    <w:p>
+      <w:pPr>
+        <w:spacing w:after="60"/>
+        <w:ind w:left="170"/>
+      </w:pPr>
+      <w:r>
+        <w:rPr>
+          <w:b/>
+          <w:color w:val="2FA823"/>
+          <w:sz w:val="21"/>
+        </w:rPr>
+        <w:t xml:space="preserve">5.  </w:t>
+      </w:r>
+      <w:r>
+        <w:rPr>
+          <w:color w:val="1F2937"/>
+          <w:sz w:val="21"/>
+        </w:rPr>
+        <w:t>When a visitor clicks the link, the site remembers that affiliate for 60 days.</w:t>
+      </w:r>
+    </w:p>
+    <w:p>
+      <w:pPr>
+        <w:spacing w:after="60"/>
+        <w:ind w:left="170"/>
+      </w:pPr>
+      <w:r>
+        <w:rPr>
+          <w:b/>
+          <w:color w:val="2FA823"/>
+          <w:sz w:val="21"/>
+        </w:rPr>
+        <w:t xml:space="preserve">6.  </w:t>
+      </w:r>
+      <w:r>
+        <w:rPr>
+          <w:color w:val="1F2937"/>
+          <w:sz w:val="21"/>
+        </w:rPr>
+        <w:t>If that visitor buys the e-book, the sale is automatically credited to the affiliate and a commission is recorded.</w:t>
+      </w:r>
+    </w:p>
+    <w:p>
+      <w:pPr>
+        <w:spacing w:after="60"/>
+        <w:ind w:left="170"/>
+      </w:pPr>
+      <w:r>
+        <w:rPr>
+          <w:b/>
+          <w:color w:val="2FA823"/>
+          <w:sz w:val="21"/>
+        </w:rPr>
+        <w:t xml:space="preserve">7.  </w:t>
+      </w:r>
+      <w:r>
+        <w:rPr>
+          <w:color w:val="1F2937"/>
+          <w:sz w:val="21"/>
+        </w:rPr>
+        <w:t>The affiliate sees their earnings (pending, approved, paid) in their dashboard and enters their banking details.</w:t>
+      </w:r>
+    </w:p>
+    <w:p>
+      <w:pPr>
+        <w:spacing w:after="60"/>
+        <w:ind w:left="170"/>
+      </w:pPr>
+      <w:r>
+        <w:rPr>
+          <w:b/>
+          <w:color w:val="2FA823"/>
+          <w:sz w:val="21"/>
+        </w:rPr>
+        <w:t xml:space="preserve">8.  </w:t>
+      </w:r>
+      <w:r>
+        <w:rPr>
+          <w:color w:val="1F2937"/>
+          <w:sz w:val="21"/>
+        </w:rPr>
+        <w:t>You review commissions and mark them approved or paid under Admin → E-book.</w:t>
+      </w:r>
+    </w:p>
+    <w:p>
+      <w:pPr>
+        <w:spacing w:before="60" w:after="200"/>
+        <w:ind w:left="170"/>
+      </w:pPr>
+      <w:r>
+        <w:rPr>
+          <w:b/>
+          <w:color w:val="2FA823"/>
+          <w:sz w:val="20"/>
+        </w:rPr>
+        <w:t xml:space="preserve">You control:  </w:t>
+      </w:r>
+      <w:r>
+        <w:rPr>
+          <w:color w:val="475569"/>
+          <w:sz w:val="20"/>
+        </w:rPr>
+        <w:t>who gets approved, the commission rate (a percentage or a fixed amount), and when commissions are paid out.</w:t>
+      </w:r>
+    </w:p>
+    <w:p>
+      <w:pPr>
+        <w:keepNext/>
+        <w:spacing w:before="200" w:after="60"/>
+      </w:pPr>
+      <w:r>
+        <w:rPr>
+          <w:rFonts w:ascii="Segoe UI Semibold" w:hAnsi="Segoe UI Semibold"/>
+          <w:b/>
+          <w:color w:val="2FA823"/>
+          <w:sz w:val="25"/>
+        </w:rPr>
+        <w:t>4.3  The Job-Hunting E-book</w:t>
+      </w:r>
+    </w:p>
+    <w:p>
+      <w:pPr>
+        <w:spacing w:after="60"/>
+        <w:ind w:left="170"/>
+      </w:pPr>
+      <w:r>
+        <w:rPr>
+          <w:b/>
+          <w:color w:val="2FA823"/>
+          <w:sz w:val="21"/>
+        </w:rPr>
+        <w:t xml:space="preserve">1.  </w:t>
+      </w:r>
+      <w:r>
+        <w:rPr>
+          <w:color w:val="1F2937"/>
+          <w:sz w:val="21"/>
+        </w:rPr>
+        <w:t>You upload the e-book file and set its price and the affiliate commission under Admin → E-book.</w:t>
+      </w:r>
+    </w:p>
+    <w:p>
+      <w:pPr>
+        <w:spacing w:after="60"/>
+        <w:ind w:left="170"/>
+      </w:pPr>
+      <w:r>
+        <w:rPr>
+          <w:b/>
+          <w:color w:val="2FA823"/>
+          <w:sz w:val="21"/>
+        </w:rPr>
+        <w:t xml:space="preserve">2.  </w:t>
+      </w:r>
+      <w:r>
+        <w:rPr>
+          <w:color w:val="1F2937"/>
+          <w:sz w:val="21"/>
+        </w:rPr>
+        <w:t>A customer buys it on the E-book page via secure PayFast checkout.</w:t>
+      </w:r>
+    </w:p>
+    <w:p>
+      <w:pPr>
+        <w:spacing w:after="60"/>
+        <w:ind w:left="170"/>
+      </w:pPr>
+      <w:r>
+        <w:rPr>
+          <w:b/>
+          <w:color w:val="2FA823"/>
+          <w:sz w:val="21"/>
+        </w:rPr>
+        <w:t xml:space="preserve">3.  </w:t>
+      </w:r>
+      <w:r>
+        <w:rPr>
+          <w:color w:val="1F2937"/>
+          <w:sz w:val="21"/>
+        </w:rPr>
+        <w:t>They receive an instant download.</w:t>
+      </w:r>
+    </w:p>
+    <w:p>
+      <w:pPr>
+        <w:spacing w:after="60"/>
+        <w:ind w:left="170"/>
+      </w:pPr>
+      <w:r>
+        <w:rPr>
+          <w:b/>
+          <w:color w:val="2FA823"/>
+          <w:sz w:val="21"/>
+        </w:rPr>
+        <w:t xml:space="preserve">4.  </w:t>
+      </w:r>
+      <w:r>
+        <w:rPr>
+          <w:color w:val="1F2937"/>
+          <w:sz w:val="21"/>
+        </w:rPr>
+        <w:t>If they arrived through an affiliate's link, that affiliate automatically earns commission.</w:t>
+      </w:r>
+    </w:p>
+    <w:p>
+      <w:pPr>
+        <w:spacing w:before="60" w:after="200"/>
+        <w:ind w:left="170"/>
+      </w:pPr>
+      <w:r>
+        <w:rPr>
+          <w:b/>
+          <w:color w:val="2FA823"/>
+          <w:sz w:val="20"/>
+        </w:rPr>
+        <w:t xml:space="preserve">You control:  </w:t>
+      </w:r>
+      <w:r>
+        <w:rPr>
+          <w:color w:val="475569"/>
+          <w:sz w:val="20"/>
+        </w:rPr>
+        <w:t>the file, the price, the commission, and a view of every sale.</w:t>
+      </w:r>
+    </w:p>
+    <w:p>
+      <w:pPr>
+        <w:keepNext/>
+        <w:spacing w:before="200" w:after="60"/>
+      </w:pPr>
+      <w:r>
+        <w:rPr>
+          <w:rFonts w:ascii="Segoe UI Semibold" w:hAnsi="Segoe UI Semibold"/>
+          <w:b/>
+          <w:color w:val="2FA823"/>
+          <w:sz w:val="25"/>
+        </w:rPr>
+        <w:t>4.4  Insights — the AI article engine</w:t>
+      </w:r>
+    </w:p>
+    <w:p>
+      <w:pPr>
+        <w:spacing w:after="120"/>
+      </w:pPr>
+      <w:r>
+        <w:rPr>
+          <w:color w:val="1F2937"/>
+          <w:sz w:val="21"/>
+        </w:rPr>
+        <w:t>Builds search authority and brings in traffic, while keeping you in full control of what actually goes live.</w:t>
+      </w:r>
+    </w:p>
+    <w:p>
+      <w:pPr>
+        <w:spacing w:after="60"/>
+        <w:ind w:left="170"/>
+      </w:pPr>
+      <w:r>
+        <w:rPr>
+          <w:b/>
+          <w:color w:val="2FA823"/>
+          <w:sz w:val="21"/>
+        </w:rPr>
+        <w:t xml:space="preserve">1.  </w:t>
+      </w:r>
+      <w:r>
+        <w:rPr>
+          <w:color w:val="1F2937"/>
+          <w:sz w:val="21"/>
+        </w:rPr>
+        <w:t>Twice a month the system automatically writes two draft articles using AI, rotating through five topics: hiring, labour law, careers, employment trends, and payroll &amp; HR.</w:t>
+      </w:r>
+    </w:p>
+    <w:p>
+      <w:pPr>
+        <w:spacing w:after="60"/>
+        <w:ind w:left="170"/>
+      </w:pPr>
+      <w:r>
+        <w:rPr>
+          <w:b/>
+          <w:color w:val="2FA823"/>
+          <w:sz w:val="21"/>
+        </w:rPr>
+        <w:t xml:space="preserve">2.  </w:t>
+      </w:r>
+      <w:r>
+        <w:rPr>
+          <w:color w:val="1F2937"/>
+          <w:sz w:val="21"/>
+        </w:rPr>
+        <w:t>Drafts wait safely under Admin → Insights — nothing is published automatically without your approval.</w:t>
+      </w:r>
+    </w:p>
+    <w:p>
+      <w:pPr>
+        <w:spacing w:after="60"/>
+        <w:ind w:left="170"/>
+      </w:pPr>
+      <w:r>
+        <w:rPr>
+          <w:b/>
+          <w:color w:val="2FA823"/>
+          <w:sz w:val="21"/>
+        </w:rPr>
+        <w:t xml:space="preserve">3.  </w:t>
+      </w:r>
+      <w:r>
+        <w:rPr>
+          <w:color w:val="1F2937"/>
+          <w:sz w:val="21"/>
+        </w:rPr>
+        <w:t>You open a draft, edit anything you like, then either Approve it (to publish on a chosen date) or Publish now.</w:t>
+      </w:r>
+    </w:p>
+    <w:p>
+      <w:pPr>
+        <w:spacing w:after="60"/>
+        <w:ind w:left="170"/>
+      </w:pPr>
+      <w:r>
+        <w:rPr>
+          <w:b/>
+          <w:color w:val="2FA823"/>
+          <w:sz w:val="21"/>
+        </w:rPr>
+        <w:t xml:space="preserve">4.  </w:t>
+      </w:r>
+      <w:r>
+        <w:rPr>
+          <w:color w:val="1F2937"/>
+          <w:sz w:val="21"/>
+        </w:rPr>
+        <w:t>You can also Write a new article by hand, or Generate one with AI on demand, at any time.</w:t>
+      </w:r>
+    </w:p>
+    <w:p>
+      <w:pPr>
+        <w:spacing w:after="60"/>
+        <w:ind w:left="170"/>
+      </w:pPr>
+      <w:r>
+        <w:rPr>
+          <w:b/>
+          <w:color w:val="2FA823"/>
+          <w:sz w:val="21"/>
+        </w:rPr>
+        <w:t xml:space="preserve">5.  </w:t>
+      </w:r>
+      <w:r>
+        <w:rPr>
+          <w:color w:val="1F2937"/>
+          <w:sz w:val="21"/>
+        </w:rPr>
+        <w:t>Published articles appear on the Insights page, formatted for Google and quotable by AI search tools such as ChatGPT.</w:t>
+      </w:r>
+    </w:p>
+    <w:p>
+      <w:pPr>
+        <w:spacing w:before="60" w:after="200"/>
+        <w:ind w:left="170"/>
+      </w:pPr>
+      <w:r>
+        <w:rPr>
+          <w:b/>
+          <w:color w:val="2FA823"/>
+          <w:sz w:val="20"/>
+        </w:rPr>
+        <w:t xml:space="preserve">You control:  </w:t>
+      </w:r>
+      <w:r>
+        <w:rPr>
+          <w:color w:val="475569"/>
+          <w:sz w:val="20"/>
+        </w:rPr>
+        <w:t>every word — review, edit, approve, schedule, publish or discard each article.</w:t>
+      </w:r>
+    </w:p>
+    <w:p>
+      <w:pPr>
+        <w:keepNext/>
+        <w:spacing w:before="200" w:after="60"/>
+      </w:pPr>
+      <w:r>
+        <w:rPr>
+          <w:rFonts w:ascii="Segoe UI Semibold" w:hAnsi="Segoe UI Semibold"/>
+          <w:b/>
+          <w:color w:val="2FA823"/>
+          <w:sz w:val="25"/>
+        </w:rPr>
+        <w:t>4.5  Jobs &amp; Submit CV</w:t>
+      </w:r>
+    </w:p>
+    <w:p>
+      <w:pPr>
+        <w:spacing w:after="60"/>
+        <w:ind w:left="170"/>
+      </w:pPr>
+      <w:r>
+        <w:rPr>
+          <w:b/>
+          <w:color w:val="2FA823"/>
+          <w:sz w:val="21"/>
+        </w:rPr>
+        <w:t xml:space="preserve">1.  </w:t>
+      </w:r>
+      <w:r>
+        <w:rPr>
+          <w:color w:val="1F2937"/>
+          <w:sz w:val="21"/>
+        </w:rPr>
+        <w:t>The Jobs page displays your live vacancies straight from PlacementPartner, so it is always current with no manual updates.</w:t>
+      </w:r>
+    </w:p>
+    <w:p>
+      <w:pPr>
+        <w:spacing w:after="60"/>
+        <w:ind w:left="170"/>
+      </w:pPr>
+      <w:r>
+        <w:rPr>
+          <w:b/>
+          <w:color w:val="2FA823"/>
+          <w:sz w:val="21"/>
+        </w:rPr>
+        <w:t xml:space="preserve">2.  </w:t>
+      </w:r>
+      <w:r>
+        <w:rPr>
+          <w:color w:val="1F2937"/>
+          <w:sz w:val="21"/>
+        </w:rPr>
+        <w:t>The Submit CV page lets job seekers send their CV directly into your PlacementPartner talent pool.</w:t>
+      </w:r>
+    </w:p>
+    <w:p>
+      <w:pPr>
+        <w:keepNext/>
+        <w:spacing w:before="200" w:after="60"/>
+      </w:pPr>
+      <w:r>
+        <w:rPr>
+          <w:rFonts w:ascii="Segoe UI Semibold" w:hAnsi="Segoe UI Semibold"/>
+          <w:b/>
+          <w:color w:val="2FA823"/>
+          <w:sz w:val="25"/>
+        </w:rPr>
+        <w:t>4.6  Customer &amp; affiliate self-service</w:t>
+      </w:r>
+    </w:p>
+    <w:p>
+      <w:pPr>
+        <w:pStyle w:val="ListBullet"/>
+        <w:spacing w:after="60"/>
+        <w:ind w:left="340"/>
+      </w:pPr>
+      <w:r>
+        <w:rPr>
+          <w:b/>
+          <w:color w:val="011D58"/>
+          <w:sz w:val="21"/>
+        </w:rPr>
+        <w:t xml:space="preserve">Affiliate dashboard — </w:t>
+      </w:r>
+      <w:r>
+        <w:rPr>
+          <w:color w:val="1F2937"/>
+          <w:sz w:val="21"/>
+        </w:rPr>
+        <w:t>affiliates manage their own link, see their sales and earnings, and capture their banking details.</w:t>
+      </w:r>
+    </w:p>
+    <w:p>
+      <w:pPr>
+        <w:pStyle w:val="ListBullet"/>
+        <w:spacing w:after="60"/>
+        <w:ind w:left="340"/>
+      </w:pPr>
+      <w:r>
+        <w:rPr>
+          <w:b/>
+          <w:color w:val="011D58"/>
+          <w:sz w:val="21"/>
+        </w:rPr>
+        <w:t xml:space="preserve">Customer order portal — </w:t>
+      </w:r>
+      <w:r>
+        <w:rPr>
+          <w:color w:val="1F2937"/>
+          <w:sz w:val="21"/>
+        </w:rPr>
+        <w:t>a private, password-free link where service customers track status, upload documents, book appointments, download the finished work and request revisions.</w:t>
+      </w:r>
+    </w:p>
+    <w:p>
+      <w:pPr>
+        <w:keepNext/>
+        <w:spacing w:before="320" w:after="40"/>
+      </w:pPr>
+      <w:r>
+        <w:rPr>
+          <w:rFonts w:ascii="Segoe UI Semibold" w:hAnsi="Segoe UI Semibold"/>
+          <w:b/>
+          <w:color w:val="2FA823"/>
+          <w:sz w:val="34"/>
+        </w:rPr>
+        <w:t xml:space="preserve">5  </w:t>
+      </w:r>
+      <w:r>
+        <w:rPr>
+          <w:rFonts w:ascii="Segoe UI Semibold" w:hAnsi="Segoe UI Semibold"/>
+          <w:b/>
+          <w:color w:val="011D58"/>
+          <w:sz w:val="34"/>
+        </w:rPr>
         <w:t>What already makes this site stand out</w:t>
       </w:r>
     </w:p>
@@ -1892,7 +2792,7 @@
           <w:color w:val="2FA823"/>
           <w:sz w:val="34"/>
         </w:rPr>
-        <w:t xml:space="preserve">5  </w:t>
+        <w:t xml:space="preserve">6  </w:t>
       </w:r>
       <w:r>
         <w:rPr>
@@ -3255,7 +4155,7 @@
           <w:color w:val="2FA823"/>
           <w:sz w:val="34"/>
         </w:rPr>
-        <w:t xml:space="preserve">6  </w:t>
+        <w:t xml:space="preserve">7  </w:t>
       </w:r>
       <w:r>
         <w:rPr>
@@ -3507,7 +4407,7 @@
                 <w:color w:val="475569"/>
                 <w:sz w:val="20"/>
               </w:rPr>
-              <w:t>Everything in sections 2–4 is built and live (some features, such as the AI Insights engine and online payments, simply need their accounts/keys switched on). Sections 5–6 are recommendations we can scope and quote individually.</w:t>
+              <w:t>Everything in sections 2–5 is built and live (some features, such as the AI Insights engine and online payments, simply need their accounts/keys switched on). Sections 6–7 are recommendations we can scope and quote individually.</w:t>
             </w:r>
           </w:p>
         </w:tc>

</xml_diff>